<commit_message>
Four levels of fields for searching records.
</commit_message>
<xml_diff>
--- a/MeshPass.docx
+++ b/MeshPass.docx
@@ -355,6 +355,67 @@
         <w:t>Password generator – show generated passwords with letters, numerals, and special characters in different colors (lowercase black, uppercase gray, numerals blue, specials red)</w:t>
       </w:r>
     </w:p>
+    <w:p>
+      <w:pPr>
+        <w:pStyle w:val="Heading2"/>
+      </w:pPr>
+      <w:r>
+        <w:t>Searching</w:t>
+      </w:r>
+    </w:p>
+    <w:p>
+      <w:r>
+        <w:t>Check boxes for what to search:</w:t>
+      </w:r>
+    </w:p>
+    <w:p>
+      <w:pPr>
+        <w:pStyle w:val="ListParagraph"/>
+        <w:numPr>
+          <w:ilvl w:val="0"/>
+          <w:numId w:val="5"/>
+        </w:numPr>
+      </w:pPr>
+      <w:r>
+        <w:t>Title field</w:t>
+      </w:r>
+    </w:p>
+    <w:p>
+      <w:pPr>
+        <w:pStyle w:val="ListParagraph"/>
+        <w:numPr>
+          <w:ilvl w:val="0"/>
+          <w:numId w:val="5"/>
+        </w:numPr>
+      </w:pPr>
+      <w:r>
+        <w:t>All unmasked fields</w:t>
+      </w:r>
+    </w:p>
+    <w:p>
+      <w:pPr>
+        <w:pStyle w:val="ListParagraph"/>
+        <w:numPr>
+          <w:ilvl w:val="0"/>
+          <w:numId w:val="5"/>
+        </w:numPr>
+      </w:pPr>
+      <w:r>
+        <w:t>Masked fields</w:t>
+      </w:r>
+    </w:p>
+    <w:p>
+      <w:pPr>
+        <w:pStyle w:val="ListParagraph"/>
+        <w:numPr>
+          <w:ilvl w:val="0"/>
+          <w:numId w:val="5"/>
+        </w:numPr>
+      </w:pPr>
+      <w:r>
+        <w:t>Passwords and PINs (if they can be distinguished from other masked fields)</w:t>
+      </w:r>
+    </w:p>
     <w:p/>
     <w:p>
       <w:pPr>
@@ -575,6 +636,7 @@
         <w:pStyle w:val="Heading2"/>
       </w:pPr>
       <w:r>
+        <w:lastRenderedPageBreak/>
         <w:t>Syncing</w:t>
       </w:r>
     </w:p>
@@ -613,7 +675,6 @@
         </w:numPr>
       </w:pPr>
       <w:r>
-        <w:lastRenderedPageBreak/>
         <w:t>Give the requesting user the opportunity to share selected records with the other user</w:t>
       </w:r>
       <w:r>
@@ -723,7 +784,11 @@
         <w:t xml:space="preserve"> at the Application layer (TCP KeepAlives are an optional feature, and can’t be depended on</w:t>
       </w:r>
       <w:r>
-        <w:t>; also, the parameters for TCP KeepAlives seem to be of system scope, not per process or connection</w:t>
+        <w:t xml:space="preserve">; also, the parameters for TCP KeepAlives seem to be of </w:t>
+      </w:r>
+      <w:r>
+        <w:lastRenderedPageBreak/>
+        <w:t>system scope, not per process or connection</w:t>
       </w:r>
       <w:r>
         <w:t>).</w:t>
@@ -743,11 +808,7 @@
     </w:p>
     <w:p>
       <w:r>
-        <w:t xml:space="preserve">Will synced records pass through the RP, or will the RP just assist the two MeshPass devices to connect directly with each other?  For security, it would be preferable for the RP to only assist in a direct </w:t>
-      </w:r>
-      <w:r>
-        <w:lastRenderedPageBreak/>
-        <w:t>connection.  But the RP can also help when both MeshPass devices are behind NATs, and neither can be addressed directly.</w:t>
+        <w:t>Will synced records pass through the RP, or will the RP just assist the two MeshPass devices to connect directly with each other?  For security, it would be preferable for the RP to only assist in a direct connection.  But the RP can also help when both MeshPass devices are behind NATs, and neither can be addressed directly.</w:t>
       </w:r>
     </w:p>
     <w:sectPr>
@@ -1102,6 +1163,119 @@
     </w:lvl>
   </w:abstractNum>
   <w:abstractNum w:abstractNumId="3" w15:restartNumberingAfterBreak="0">
+    <w:nsid w:val="46626946"/>
+    <w:multiLevelType w:val="hybridMultilevel"/>
+    <w:tmpl w:val="FA5AF0D6"/>
+    <w:lvl w:ilvl="0" w:tplc="04090001">
+      <w:start w:val="1"/>
+      <w:numFmt w:val="bullet"/>
+      <w:lvlText w:val=""/>
+      <w:lvlJc w:val="left"/>
+      <w:pPr>
+        <w:ind w:left="720" w:hanging="360"/>
+      </w:pPr>
+      <w:rPr>
+        <w:rFonts w:ascii="Symbol" w:hAnsi="Symbol" w:hint="default"/>
+      </w:rPr>
+    </w:lvl>
+    <w:lvl w:ilvl="1" w:tplc="04090003" w:tentative="1">
+      <w:start w:val="1"/>
+      <w:numFmt w:val="bullet"/>
+      <w:lvlText w:val="o"/>
+      <w:lvlJc w:val="left"/>
+      <w:pPr>
+        <w:ind w:left="1440" w:hanging="360"/>
+      </w:pPr>
+      <w:rPr>
+        <w:rFonts w:ascii="Courier New" w:hAnsi="Courier New" w:cs="Courier New" w:hint="default"/>
+      </w:rPr>
+    </w:lvl>
+    <w:lvl w:ilvl="2" w:tplc="04090005" w:tentative="1">
+      <w:start w:val="1"/>
+      <w:numFmt w:val="bullet"/>
+      <w:lvlText w:val=""/>
+      <w:lvlJc w:val="left"/>
+      <w:pPr>
+        <w:ind w:left="2160" w:hanging="360"/>
+      </w:pPr>
+      <w:rPr>
+        <w:rFonts w:ascii="Wingdings" w:hAnsi="Wingdings" w:hint="default"/>
+      </w:rPr>
+    </w:lvl>
+    <w:lvl w:ilvl="3" w:tplc="04090001" w:tentative="1">
+      <w:start w:val="1"/>
+      <w:numFmt w:val="bullet"/>
+      <w:lvlText w:val=""/>
+      <w:lvlJc w:val="left"/>
+      <w:pPr>
+        <w:ind w:left="2880" w:hanging="360"/>
+      </w:pPr>
+      <w:rPr>
+        <w:rFonts w:ascii="Symbol" w:hAnsi="Symbol" w:hint="default"/>
+      </w:rPr>
+    </w:lvl>
+    <w:lvl w:ilvl="4" w:tplc="04090003" w:tentative="1">
+      <w:start w:val="1"/>
+      <w:numFmt w:val="bullet"/>
+      <w:lvlText w:val="o"/>
+      <w:lvlJc w:val="left"/>
+      <w:pPr>
+        <w:ind w:left="3600" w:hanging="360"/>
+      </w:pPr>
+      <w:rPr>
+        <w:rFonts w:ascii="Courier New" w:hAnsi="Courier New" w:cs="Courier New" w:hint="default"/>
+      </w:rPr>
+    </w:lvl>
+    <w:lvl w:ilvl="5" w:tplc="04090005" w:tentative="1">
+      <w:start w:val="1"/>
+      <w:numFmt w:val="bullet"/>
+      <w:lvlText w:val=""/>
+      <w:lvlJc w:val="left"/>
+      <w:pPr>
+        <w:ind w:left="4320" w:hanging="360"/>
+      </w:pPr>
+      <w:rPr>
+        <w:rFonts w:ascii="Wingdings" w:hAnsi="Wingdings" w:hint="default"/>
+      </w:rPr>
+    </w:lvl>
+    <w:lvl w:ilvl="6" w:tplc="04090001" w:tentative="1">
+      <w:start w:val="1"/>
+      <w:numFmt w:val="bullet"/>
+      <w:lvlText w:val=""/>
+      <w:lvlJc w:val="left"/>
+      <w:pPr>
+        <w:ind w:left="5040" w:hanging="360"/>
+      </w:pPr>
+      <w:rPr>
+        <w:rFonts w:ascii="Symbol" w:hAnsi="Symbol" w:hint="default"/>
+      </w:rPr>
+    </w:lvl>
+    <w:lvl w:ilvl="7" w:tplc="04090003" w:tentative="1">
+      <w:start w:val="1"/>
+      <w:numFmt w:val="bullet"/>
+      <w:lvlText w:val="o"/>
+      <w:lvlJc w:val="left"/>
+      <w:pPr>
+        <w:ind w:left="5760" w:hanging="360"/>
+      </w:pPr>
+      <w:rPr>
+        <w:rFonts w:ascii="Courier New" w:hAnsi="Courier New" w:cs="Courier New" w:hint="default"/>
+      </w:rPr>
+    </w:lvl>
+    <w:lvl w:ilvl="8" w:tplc="04090005" w:tentative="1">
+      <w:start w:val="1"/>
+      <w:numFmt w:val="bullet"/>
+      <w:lvlText w:val=""/>
+      <w:lvlJc w:val="left"/>
+      <w:pPr>
+        <w:ind w:left="6480" w:hanging="360"/>
+      </w:pPr>
+      <w:rPr>
+        <w:rFonts w:ascii="Wingdings" w:hAnsi="Wingdings" w:hint="default"/>
+      </w:rPr>
+    </w:lvl>
+  </w:abstractNum>
+  <w:abstractNum w:abstractNumId="4" w15:restartNumberingAfterBreak="0">
     <w:nsid w:val="5A8724BB"/>
     <w:multiLevelType w:val="hybridMultilevel"/>
     <w:tmpl w:val="8DCA1716"/>
@@ -1221,10 +1395,13 @@
     <w:abstractNumId w:val="1"/>
   </w:num>
   <w:num w:numId="3" w16cid:durableId="1236622007">
-    <w:abstractNumId w:val="3"/>
+    <w:abstractNumId w:val="4"/>
   </w:num>
   <w:num w:numId="4" w16cid:durableId="491868456">
     <w:abstractNumId w:val="2"/>
+  </w:num>
+  <w:num w:numId="5" w16cid:durableId="324094225">
+    <w:abstractNumId w:val="3"/>
   </w:num>
 </w:numbering>
 </file>

</xml_diff>